<commit_message>
Add pushbutton & RGB LED activity materials
</commit_message>
<xml_diff>
--- a/docs/cohort26/jul26/breadboard_pushbutton_student_handout.docx
+++ b/docs/cohort26/jul26/breadboard_pushbutton_student_handout.docx
@@ -13,7 +13,7 @@
         <mc:AlternateContent>
           <mc:Choice Requires="wps">
             <w:drawing>
-              <wp:anchor behindDoc="1" distT="8890" distB="8890" distL="8890" distR="8890" simplePos="0" locked="0" layoutInCell="1" allowOverlap="1" relativeHeight="33" wp14:anchorId="3FD69BB3">
+              <wp:anchor behindDoc="1" distT="8890" distB="8890" distL="8890" distR="8890" simplePos="0" locked="0" layoutInCell="1" allowOverlap="1" relativeHeight="32" wp14:anchorId="3FD69BB3">
                 <wp:simplePos x="0" y="0"/>
                 <wp:positionH relativeFrom="column">
                   <wp:posOffset>0</wp:posOffset>
@@ -168,11 +168,7 @@
         </w:rPr>
       </w:pPr>
       <w:r>
-        <w:rPr>
-          <w:rFonts w:ascii="Arial Nova" w:hAnsi="Arial Nova"/>
-          <w:sz w:val="40"/>
-          <w:szCs w:val="40"/>
-        </w:rPr>
+        <w:rPr/>
         <w:drawing>
           <wp:inline distT="0" distB="0" distL="0" distR="0">
             <wp:extent cx="1605915" cy="1393825"/>
@@ -246,47 +242,23 @@
           <w:sz w:val="24"/>
           <w:szCs w:val="24"/>
         </w:rPr>
-        <w:t xml:space="preserve">Build a program that will </w:t>
-      </w:r>
-      <w:r>
-        <w:rPr>
-          <w:rFonts w:cs="Arial" w:ascii="Arial" w:hAnsi="Arial"/>
-          <w:sz w:val="24"/>
-          <w:szCs w:val="24"/>
-        </w:rPr>
-        <w:t>d</w:t>
-      </w:r>
-      <w:r>
-        <w:rPr>
-          <w:rFonts w:cs="Arial" w:ascii="Arial" w:hAnsi="Arial"/>
-          <w:sz w:val="24"/>
-          <w:szCs w:val="24"/>
-        </w:rPr>
-        <w:t>isplay a one when the button is pushed and display a zero otherwise</w:t>
-      </w:r>
-      <w:r>
-        <w:rPr>
-          <w:rFonts w:cs="Arial" w:ascii="Arial" w:hAnsi="Arial"/>
-          <w:sz w:val="24"/>
-          <w:szCs w:val="24"/>
-        </w:rPr>
-        <w:t xml:space="preserve">. </w:t>
-      </w:r>
-      <w:r>
-        <w:rPr>
-          <w:rFonts w:cs="Arial" w:ascii="Arial" w:hAnsi="Arial"/>
-          <w:sz w:val="24"/>
-          <w:szCs w:val="24"/>
-        </w:rPr>
-        <w:t>T</w:t>
-      </w:r>
-      <w:r>
-        <w:rPr>
-          <w:rFonts w:cs="Arial" w:ascii="Arial" w:hAnsi="Arial"/>
-          <w:sz w:val="24"/>
-          <w:szCs w:val="24"/>
-        </w:rPr>
-        <w:t>he pushbutton wired on the breadboard and connected to the Micro:bit.</w:t>
+        <w:t xml:space="preserve">Build a program that will display a one when the button is pushed and display a zero otherwise. The pushbutton wired on the breadboard and connected to the </w:t>
+      </w:r>
+      <w:r>
+        <w:rPr>
+          <w:rFonts w:cs="Arial" w:ascii="Arial" w:hAnsi="Arial"/>
+          <w:sz w:val="24"/>
+          <w:szCs w:val="24"/>
+        </w:rPr>
+        <w:t>m</w:t>
+      </w:r>
+      <w:r>
+        <w:rPr>
+          <w:rFonts w:cs="Arial" w:ascii="Arial" w:hAnsi="Arial"/>
+          <w:sz w:val="24"/>
+          <w:szCs w:val="24"/>
+        </w:rPr>
+        <w:t>icro:bit.</w:t>
       </w:r>
     </w:p>
     <w:p>
@@ -370,48 +342,14 @@
           <w:sz w:val="28"/>
           <w:szCs w:val="28"/>
         </w:rPr>
-        <w:t>S</w:t>
-      </w:r>
-      <w:r>
-        <w:rPr>
-          <w:b/>
-          <w:bCs/>
-          <w:color w:themeColor="accent6" w:themeShade="bf" w:val="538135"/>
-          <w:sz w:val="28"/>
-          <w:szCs w:val="28"/>
-        </w:rPr>
-        <w:t>e</w:t>
-      </w:r>
-      <w:r>
-        <w:rPr>
-          <w:b/>
-          <w:bCs/>
-          <w:color w:themeColor="accent6" w:themeShade="bf" w:val="538135"/>
-          <w:sz w:val="28"/>
-          <w:szCs w:val="28"/>
-        </w:rPr>
-        <w:t>lection</w:t>
-      </w:r>
-      <w:r>
-        <w:rPr>
-          <w:sz w:val="28"/>
-          <w:szCs w:val="28"/>
-        </w:rPr>
-        <w:t xml:space="preserve">: </w:t>
-      </w:r>
-      <w:r>
-        <w:rPr>
-          <w:sz w:val="28"/>
-          <w:szCs w:val="28"/>
-        </w:rPr>
-        <w:t>Using a boolean condition to determine which of two parts of an algorithm is used</w:t>
-      </w:r>
-      <w:r>
-        <w:rPr>
-          <w:sz w:val="28"/>
-          <w:szCs w:val="28"/>
-        </w:rPr>
-        <w:t xml:space="preserve">. </w:t>
+        <w:t>Selection</w:t>
+      </w:r>
+      <w:r>
+        <w:rPr>
+          <w:sz w:val="28"/>
+          <w:szCs w:val="28"/>
+        </w:rPr>
+        <w:t xml:space="preserve">: Using a boolean condition to determine which of two parts of an algorithm is used. </w:t>
       </w:r>
     </w:p>
     <w:p>
@@ -425,13 +363,13 @@
       </w:pPr>
       <w:r>
         <w:rPr>
-          <w:rFonts w:cs="Arial"/>
-          <w:sz w:val="28"/>
-          <w:szCs w:val="28"/>
-        </w:rPr>
-      </w:r>
-      <w:bookmarkStart w:id="1" w:name="_Hlk104661088"/>
-      <w:bookmarkStart w:id="2" w:name="_Hlk104661088"/>
+          <w:rFonts w:ascii="Arial Black" w:hAnsi="Arial Black"/>
+          <w:sz w:val="28"/>
+          <w:szCs w:val="28"/>
+        </w:rPr>
+      </w:r>
+      <w:bookmarkStart w:id="1" w:name="_Hlk104661088_Copy_1"/>
+      <w:bookmarkStart w:id="2" w:name="_Hlk104661088_Copy_1"/>
       <w:bookmarkEnd w:id="2"/>
     </w:p>
     <w:p>
@@ -674,23 +612,7 @@
           <w:sz w:val="28"/>
           <w:szCs w:val="28"/>
         </w:rPr>
-        <w:t xml:space="preserve">Making </w:t>
-      </w:r>
-      <w:r>
-        <w:rPr>
-          <w:rFonts w:ascii="Arial Black" w:hAnsi="Arial Black"/>
-          <w:sz w:val="28"/>
-          <w:szCs w:val="28"/>
-        </w:rPr>
-        <w:t>(alternate wiring)</w:t>
-      </w:r>
-      <w:r>
-        <w:rPr>
-          <w:rFonts w:ascii="Arial Black" w:hAnsi="Arial Black"/>
-          <w:sz w:val="28"/>
-          <w:szCs w:val="28"/>
-        </w:rPr>
-        <w:t>:</w:t>
+        <w:t>Making (alternate wiring):</w:t>
       </w:r>
     </w:p>
     <w:p>
@@ -705,9 +627,9 @@
       </w:pPr>
       <w:r>
         <w:rPr>
-          <w:rFonts w:cs="Arial" w:ascii="Arial" w:hAnsi="Arial"/>
-          <w:sz w:val="24"/>
-          <w:szCs w:val="24"/>
+          <w:rFonts w:cs="Arial" w:ascii="Arial Black" w:hAnsi="Arial Black"/>
+          <w:sz w:val="28"/>
+          <w:szCs w:val="28"/>
         </w:rPr>
       </w:r>
     </w:p>
@@ -723,9 +645,9 @@
       </w:pPr>
       <w:r>
         <w:rPr>
-          <w:rFonts w:cs="Arial" w:ascii="Arial" w:hAnsi="Arial"/>
-          <w:sz w:val="24"/>
-          <w:szCs w:val="24"/>
+          <w:rFonts w:cs="Arial" w:ascii="Arial Black" w:hAnsi="Arial Black"/>
+          <w:sz w:val="28"/>
+          <w:szCs w:val="28"/>
         </w:rPr>
         <w:drawing>
           <wp:anchor behindDoc="0" distT="0" distB="0" distL="0" distR="0" simplePos="0" locked="0" layoutInCell="0" allowOverlap="1" relativeHeight="40">
@@ -878,7 +800,7 @@
         <mc:AlternateContent>
           <mc:Choice Requires="wps">
             <w:drawing>
-              <wp:anchor behindDoc="1" distT="19050" distB="23495" distL="18415" distR="30480" simplePos="0" locked="0" layoutInCell="1" allowOverlap="1" relativeHeight="34" wp14:anchorId="5C69E86E">
+              <wp:anchor behindDoc="1" distT="19050" distB="23495" distL="18415" distR="30480" simplePos="0" locked="0" layoutInCell="1" allowOverlap="1" relativeHeight="33" wp14:anchorId="5C69E86E">
                 <wp:simplePos x="0" y="0"/>
                 <wp:positionH relativeFrom="column">
                   <wp:posOffset>2349500</wp:posOffset>
@@ -1352,367 +1274,25 @@
           <w:sz w:val="24"/>
           <w:szCs w:val="24"/>
         </w:rPr>
-        <w:t xml:space="preserve">Create a variable by going to the “variables” tab and click “new variable”. Once clicked, type a variable name such as </w:t>
-      </w:r>
-      <w:r>
-        <w:rPr>
-          <w:rFonts w:cs="Arial" w:ascii="Arial" w:hAnsi="Arial"/>
-          <w:color w:themeColor="text1" w:val="000000"/>
-          <w:sz w:val="24"/>
-          <w:szCs w:val="24"/>
-        </w:rPr>
-        <w:t>p</w:t>
-      </w:r>
-      <w:r>
-        <w:rPr>
-          <w:rFonts w:cs="Arial" w:ascii="Arial" w:hAnsi="Arial"/>
-          <w:color w:themeColor="text1" w:val="000000"/>
-          <w:sz w:val="24"/>
-          <w:szCs w:val="24"/>
-        </w:rPr>
-        <w:t>ushed</w:t>
-      </w:r>
-      <w:r>
-        <w:rPr>
-          <w:rFonts w:cs="Arial" w:ascii="Arial" w:hAnsi="Arial"/>
-          <w:color w:themeColor="text1" w:val="000000"/>
-          <w:sz w:val="24"/>
-          <w:szCs w:val="24"/>
-        </w:rPr>
-        <w:t xml:space="preserve">”. Next, drag a “set” block out of the variables drawer and place it inside the “Forever” block. To read the </w:t>
-      </w:r>
-      <w:r>
-        <w:rPr>
-          <w:rFonts w:cs="Arial" w:ascii="Arial" w:hAnsi="Arial"/>
-          <w:color w:themeColor="text1" w:val="000000"/>
-          <w:sz w:val="24"/>
-          <w:szCs w:val="24"/>
-        </w:rPr>
-        <w:t>p</w:t>
-      </w:r>
-      <w:r>
-        <w:rPr>
-          <w:rFonts w:cs="Arial" w:ascii="Arial" w:hAnsi="Arial"/>
-          <w:color w:themeColor="text1" w:val="000000"/>
-          <w:sz w:val="24"/>
-          <w:szCs w:val="24"/>
-        </w:rPr>
-        <w:t>ushbutton</w:t>
-      </w:r>
-      <w:r>
-        <w:rPr>
-          <w:rFonts w:cs="Arial" w:ascii="Arial" w:hAnsi="Arial"/>
-          <w:color w:themeColor="text1" w:val="000000"/>
-          <w:sz w:val="24"/>
-          <w:szCs w:val="24"/>
-        </w:rPr>
-        <w:t>, get the “</w:t>
-      </w:r>
-      <w:r>
-        <w:rPr>
-          <w:rFonts w:cs="Arial" w:ascii="Arial" w:hAnsi="Arial"/>
-          <w:color w:themeColor="text1" w:val="000000"/>
-          <w:sz w:val="24"/>
-          <w:szCs w:val="24"/>
-        </w:rPr>
-        <w:t>d</w:t>
-      </w:r>
-      <w:r>
-        <w:rPr>
-          <w:rFonts w:cs="Arial" w:ascii="Arial" w:hAnsi="Arial"/>
-          <w:color w:themeColor="text1" w:val="000000"/>
-          <w:sz w:val="24"/>
-          <w:szCs w:val="24"/>
-        </w:rPr>
-        <w:t>igital</w:t>
-      </w:r>
-      <w:r>
-        <w:rPr>
-          <w:rFonts w:cs="Arial" w:ascii="Arial" w:hAnsi="Arial"/>
-          <w:color w:themeColor="text1" w:val="000000"/>
-          <w:sz w:val="24"/>
-          <w:szCs w:val="24"/>
-        </w:rPr>
-        <w:t xml:space="preserve"> read pin” block out of the “Pins” drawer. Put the “</w:t>
-      </w:r>
-      <w:r>
-        <w:rPr>
-          <w:rFonts w:cs="Arial" w:ascii="Arial" w:hAnsi="Arial"/>
-          <w:color w:themeColor="text1" w:val="000000"/>
-          <w:sz w:val="24"/>
-          <w:szCs w:val="24"/>
-        </w:rPr>
-        <w:t>d</w:t>
-      </w:r>
-      <w:r>
-        <w:rPr>
-          <w:rFonts w:cs="Arial" w:ascii="Arial" w:hAnsi="Arial"/>
-          <w:color w:themeColor="text1" w:val="000000"/>
-          <w:sz w:val="24"/>
-          <w:szCs w:val="24"/>
-        </w:rPr>
-        <w:t>igital</w:t>
-      </w:r>
-      <w:r>
-        <w:rPr>
-          <w:rFonts w:cs="Arial" w:ascii="Arial" w:hAnsi="Arial"/>
-          <w:color w:themeColor="text1" w:val="000000"/>
-          <w:sz w:val="24"/>
-          <w:szCs w:val="24"/>
-        </w:rPr>
-        <w:t xml:space="preserve"> read pin” block into the “set” block and make sure the pin is “P0”. Next, go to the </w:t>
-      </w:r>
-      <w:r>
-        <w:rPr>
-          <w:rFonts w:cs="Arial" w:ascii="Arial" w:hAnsi="Arial"/>
-          <w:color w:themeColor="text1" w:val="000000"/>
-          <w:sz w:val="24"/>
-          <w:szCs w:val="24"/>
-        </w:rPr>
-        <w:t>logic</w:t>
-      </w:r>
-      <w:r>
-        <w:rPr>
-          <w:rFonts w:cs="Arial" w:ascii="Arial" w:hAnsi="Arial"/>
-          <w:color w:themeColor="text1" w:val="000000"/>
-          <w:sz w:val="24"/>
-          <w:szCs w:val="24"/>
-        </w:rPr>
-        <w:t xml:space="preserve"> drawer and drag out a “</w:t>
-      </w:r>
-      <w:r>
-        <w:rPr>
-          <w:rFonts w:cs="Arial" w:ascii="Arial" w:hAnsi="Arial"/>
-          <w:color w:themeColor="text1" w:val="000000"/>
-          <w:sz w:val="24"/>
-          <w:szCs w:val="24"/>
-        </w:rPr>
-        <w:t>i</w:t>
-      </w:r>
-      <w:r>
-        <w:rPr>
-          <w:rFonts w:cs="Arial" w:ascii="Arial" w:hAnsi="Arial"/>
-          <w:color w:themeColor="text1" w:val="000000"/>
-          <w:sz w:val="24"/>
-          <w:szCs w:val="24"/>
-        </w:rPr>
-        <w:t>f</w:t>
-      </w:r>
-      <w:r>
-        <w:rPr>
-          <w:rFonts w:cs="Arial" w:ascii="Arial" w:hAnsi="Arial"/>
-          <w:color w:themeColor="text1" w:val="000000"/>
-          <w:sz w:val="24"/>
-          <w:szCs w:val="24"/>
-        </w:rPr>
-        <w:t>” block. Add the “</w:t>
-      </w:r>
-      <w:r>
-        <w:rPr>
-          <w:rFonts w:cs="Arial" w:ascii="Arial" w:hAnsi="Arial"/>
-          <w:color w:themeColor="text1" w:val="000000"/>
-          <w:sz w:val="24"/>
-          <w:szCs w:val="24"/>
-        </w:rPr>
-        <w:t>i</w:t>
-      </w:r>
-      <w:r>
-        <w:rPr>
-          <w:rFonts w:cs="Arial" w:ascii="Arial" w:hAnsi="Arial"/>
-          <w:color w:themeColor="text1" w:val="000000"/>
-          <w:sz w:val="24"/>
-          <w:szCs w:val="24"/>
-        </w:rPr>
-        <w:t>f</w:t>
-      </w:r>
-      <w:r>
-        <w:rPr>
-          <w:rFonts w:cs="Arial" w:ascii="Arial" w:hAnsi="Arial"/>
-          <w:color w:themeColor="text1" w:val="000000"/>
-          <w:sz w:val="24"/>
-          <w:szCs w:val="24"/>
-        </w:rPr>
-        <w:t xml:space="preserve">” block below your “set” block. </w:t>
-      </w:r>
-      <w:r>
-        <w:rPr>
-          <w:rFonts w:cs="Arial" w:ascii="Arial" w:hAnsi="Arial"/>
-          <w:color w:themeColor="text1" w:val="000000"/>
-          <w:sz w:val="24"/>
-          <w:szCs w:val="24"/>
-        </w:rPr>
-        <w:t>G</w:t>
-      </w:r>
-      <w:r>
-        <w:rPr>
-          <w:rFonts w:cs="Arial" w:ascii="Arial" w:hAnsi="Arial"/>
-          <w:color w:themeColor="text1" w:val="000000"/>
-          <w:sz w:val="24"/>
-          <w:szCs w:val="24"/>
-        </w:rPr>
-        <w:t xml:space="preserve">o back to the logic drawer and get a “comparison” block. </w:t>
-      </w:r>
-      <w:r>
-        <w:rPr>
-          <w:rFonts w:cs="Arial" w:ascii="Arial" w:hAnsi="Arial"/>
-          <w:color w:themeColor="text1" w:val="000000"/>
-          <w:sz w:val="24"/>
-          <w:szCs w:val="24"/>
-        </w:rPr>
-        <w:t>Add your “</w:t>
-      </w:r>
-      <w:r>
-        <w:rPr>
-          <w:rFonts w:cs="Arial" w:ascii="Arial" w:hAnsi="Arial"/>
-          <w:color w:themeColor="text1" w:val="000000"/>
-          <w:sz w:val="24"/>
-          <w:szCs w:val="24"/>
-        </w:rPr>
-        <w:t>p</w:t>
-      </w:r>
-      <w:r>
-        <w:rPr>
-          <w:rFonts w:cs="Arial" w:ascii="Arial" w:hAnsi="Arial"/>
-          <w:color w:themeColor="text1" w:val="000000"/>
-          <w:sz w:val="24"/>
-          <w:szCs w:val="24"/>
-        </w:rPr>
-        <w:t>ushed</w:t>
-      </w:r>
-      <w:r>
-        <w:rPr>
-          <w:rFonts w:cs="Arial" w:ascii="Arial" w:hAnsi="Arial"/>
-          <w:color w:themeColor="text1" w:val="000000"/>
-          <w:sz w:val="24"/>
-          <w:szCs w:val="24"/>
-        </w:rPr>
-        <w:t xml:space="preserve">” variable in the first/top slot </w:t>
-      </w:r>
-      <w:r>
-        <w:rPr>
-          <w:rFonts w:cs="Arial" w:ascii="Arial" w:hAnsi="Arial"/>
-          <w:color w:themeColor="text1" w:val="000000"/>
-          <w:sz w:val="24"/>
-          <w:szCs w:val="24"/>
-        </w:rPr>
-        <w:t>o</w:t>
-      </w:r>
-      <w:r>
-        <w:rPr>
-          <w:rFonts w:cs="Arial" w:ascii="Arial" w:hAnsi="Arial"/>
-          <w:color w:themeColor="text1" w:val="000000"/>
-          <w:sz w:val="24"/>
-          <w:szCs w:val="24"/>
-        </w:rPr>
-        <w:t>f the “comparison”</w:t>
-      </w:r>
-      <w:r>
-        <w:rPr>
-          <w:rFonts w:cs="Arial" w:ascii="Arial" w:hAnsi="Arial"/>
-          <w:color w:themeColor="text1" w:val="000000"/>
-          <w:sz w:val="24"/>
-          <w:szCs w:val="24"/>
-        </w:rPr>
-        <w:t xml:space="preserve">. </w:t>
-      </w:r>
-      <w:r>
-        <w:rPr>
-          <w:rFonts w:cs="Arial" w:ascii="Arial" w:hAnsi="Arial"/>
-          <w:color w:themeColor="text1" w:val="000000"/>
-          <w:sz w:val="24"/>
-          <w:szCs w:val="24"/>
-        </w:rPr>
-        <w:t>P</w:t>
-      </w:r>
-      <w:r>
-        <w:rPr>
-          <w:rFonts w:cs="Arial" w:ascii="Arial" w:hAnsi="Arial"/>
-          <w:color w:themeColor="text1" w:val="000000"/>
-          <w:sz w:val="24"/>
-          <w:szCs w:val="24"/>
-        </w:rPr>
-        <w:t>ut</w:t>
-      </w:r>
-      <w:r>
-        <w:rPr>
-          <w:rFonts w:cs="Arial" w:ascii="Arial" w:hAnsi="Arial"/>
-          <w:color w:themeColor="text1" w:val="000000"/>
-          <w:sz w:val="24"/>
-          <w:szCs w:val="24"/>
-        </w:rPr>
-        <w:t xml:space="preserve"> a </w:t>
-      </w:r>
-      <w:r>
-        <w:rPr>
-          <w:rFonts w:cs="Arial" w:ascii="Arial" w:hAnsi="Arial"/>
-          <w:color w:themeColor="text1" w:val="000000"/>
-          <w:sz w:val="24"/>
-          <w:szCs w:val="24"/>
-        </w:rPr>
-        <w:t>o</w:t>
-      </w:r>
-      <w:r>
-        <w:rPr>
-          <w:rFonts w:cs="Arial" w:ascii="Arial" w:hAnsi="Arial"/>
-          <w:color w:themeColor="text1" w:val="000000"/>
-          <w:sz w:val="24"/>
-          <w:szCs w:val="24"/>
-        </w:rPr>
-        <w:t>ne</w:t>
-      </w:r>
-      <w:r>
-        <w:rPr>
-          <w:rFonts w:cs="Arial" w:ascii="Arial" w:hAnsi="Arial"/>
-          <w:color w:themeColor="text1" w:val="000000"/>
-          <w:sz w:val="24"/>
-          <w:szCs w:val="24"/>
-        </w:rPr>
-        <w:t xml:space="preserve"> in the second/bottom slot. </w:t>
-      </w:r>
-      <w:r>
-        <w:rPr>
-          <w:rFonts w:cs="Arial" w:ascii="Arial" w:hAnsi="Arial"/>
-          <w:color w:themeColor="text1" w:val="000000"/>
-          <w:sz w:val="24"/>
-          <w:szCs w:val="24"/>
-        </w:rPr>
-        <w:t>M</w:t>
-      </w:r>
-      <w:r>
-        <w:rPr>
-          <w:rFonts w:cs="Arial" w:ascii="Arial" w:hAnsi="Arial"/>
-          <w:color w:themeColor="text1" w:val="000000"/>
-          <w:sz w:val="24"/>
-          <w:szCs w:val="24"/>
-        </w:rPr>
-        <w:t xml:space="preserve">ove the “comparison” block into the test of the “if” block (replace the “true”). Get a “show number” block from the basic drawer and add it to the true clause. Display the number one. Add a “show number” block to the false clause and display the number zero. </w:t>
-      </w:r>
-      <w:r>
-        <w:rPr>
-          <w:rFonts w:cs="Arial" w:ascii="Arial" w:hAnsi="Arial"/>
-          <w:color w:themeColor="text1" w:val="000000"/>
-          <w:sz w:val="24"/>
-          <w:szCs w:val="24"/>
-        </w:rPr>
-        <w:t xml:space="preserve">Finally, go into the basic tab and grab the pause” block, place it after the “plot” block and select </w:t>
-      </w:r>
-      <w:r>
-        <w:rPr>
-          <w:rFonts w:cs="Arial" w:ascii="Arial" w:hAnsi="Arial"/>
-          <w:color w:themeColor="text1" w:val="000000"/>
-          <w:sz w:val="24"/>
-          <w:szCs w:val="24"/>
-        </w:rPr>
-        <w:t>1</w:t>
-      </w:r>
-      <w:r>
-        <w:rPr>
-          <w:rFonts w:cs="Arial" w:ascii="Arial" w:hAnsi="Arial"/>
-          <w:color w:themeColor="text1" w:val="000000"/>
-          <w:sz w:val="24"/>
-          <w:szCs w:val="24"/>
-        </w:rPr>
-        <w:t>00 milliseconds. An example is shown below.</w:t>
+        <w:t>Create a variable by going to the “variables” tab and click “new variable”. Once clicked, type a variable name such as “pushed”. Next, drag a “set” block out of the variables drawer and place it inside the “Forever” block. To read the pushbutton, get the “digital read pin” block out of the “Pins” drawer. Put the “digital read pin” block into the “set” block and make sure the pin is “P0”. Next, go to the logic drawer and drag out a</w:t>
+      </w:r>
+      <w:r>
+        <w:rPr>
+          <w:rFonts w:cs="Arial" w:ascii="Arial" w:hAnsi="Arial"/>
+          <w:color w:themeColor="text1" w:val="000000"/>
+          <w:sz w:val="24"/>
+          <w:szCs w:val="24"/>
+        </w:rPr>
+        <w:t>n</w:t>
+      </w:r>
+      <w:r>
+        <w:rPr>
+          <w:rFonts w:cs="Arial" w:ascii="Arial" w:hAnsi="Arial"/>
+          <w:color w:themeColor="text1" w:val="000000"/>
+          <w:sz w:val="24"/>
+          <w:szCs w:val="24"/>
+        </w:rPr>
+        <w:t xml:space="preserve"> “if” block. Add the “if” block below your “set” block. Go back to the logic drawer and get a “comparison” block. Add your “pushed” variable in the first/top slot of the “comparison”. Put a one in the second/bottom slot. Move the “comparison” block into the test of the “if” block (replace the “true”). Get a “show number” block from the basic drawer and add it to the true clause. Display the number one. Add a “show number” block to the false clause and display the number zero. Finally, go into the basic tab and grab the pause” block, place it after the “plot” block and select 100 milliseconds. An example is shown below.</w:t>
       </w:r>
     </w:p>
     <w:p>
@@ -1756,7 +1336,7 @@
           <w:szCs w:val="24"/>
         </w:rPr>
         <w:drawing>
-          <wp:anchor behindDoc="0" distT="0" distB="0" distL="0" distR="0" simplePos="0" locked="0" layoutInCell="0" allowOverlap="1" relativeHeight="4">
+          <wp:anchor behindDoc="0" distT="0" distB="0" distL="0" distR="0" simplePos="0" locked="0" layoutInCell="0" allowOverlap="1" relativeHeight="35">
             <wp:simplePos x="0" y="0"/>
             <wp:positionH relativeFrom="column">
               <wp:posOffset>27305</wp:posOffset>
@@ -1844,106 +1424,7 @@
           <w:sz w:val="24"/>
           <w:szCs w:val="24"/>
         </w:rPr>
-        <w:t xml:space="preserve">Once you have completed assembling your blocks, click Pin 0 on the emulator. Clicking </w:t>
-      </w:r>
-      <w:r>
-        <w:rPr>
-          <w:rFonts w:cs="Arial" w:ascii="Arial" w:hAnsi="Arial"/>
-          <w:color w:themeColor="text1" w:val="000000"/>
-          <w:sz w:val="24"/>
-          <w:szCs w:val="24"/>
-        </w:rPr>
-        <w:t>t</w:t>
-      </w:r>
-      <w:r>
-        <w:rPr>
-          <w:rFonts w:cs="Arial" w:ascii="Arial" w:hAnsi="Arial"/>
-          <w:color w:themeColor="text1" w:val="000000"/>
-          <w:sz w:val="24"/>
-          <w:szCs w:val="24"/>
-        </w:rPr>
-        <w:t>he top</w:t>
-      </w:r>
-      <w:r>
-        <w:rPr>
-          <w:rFonts w:cs="Arial" w:ascii="Arial" w:hAnsi="Arial"/>
-          <w:color w:themeColor="text1" w:val="000000"/>
-          <w:sz w:val="24"/>
-          <w:szCs w:val="24"/>
-        </w:rPr>
-        <w:t xml:space="preserve"> o</w:t>
-      </w:r>
-      <w:r>
-        <w:rPr>
-          <w:rFonts w:cs="Arial" w:ascii="Arial" w:hAnsi="Arial"/>
-          <w:color w:themeColor="text1" w:val="000000"/>
-          <w:sz w:val="24"/>
-          <w:szCs w:val="24"/>
-        </w:rPr>
-        <w:t>f</w:t>
-      </w:r>
-      <w:r>
-        <w:rPr>
-          <w:rFonts w:cs="Arial" w:ascii="Arial" w:hAnsi="Arial"/>
-          <w:color w:themeColor="text1" w:val="000000"/>
-          <w:sz w:val="24"/>
-          <w:szCs w:val="24"/>
-        </w:rPr>
-        <w:t xml:space="preserve"> Pin 0 in the emulator should change the </w:t>
-      </w:r>
-      <w:r>
-        <w:rPr>
-          <w:rFonts w:cs="Arial" w:ascii="Arial" w:hAnsi="Arial"/>
-          <w:color w:themeColor="text1" w:val="000000"/>
-          <w:sz w:val="24"/>
-          <w:szCs w:val="24"/>
-        </w:rPr>
-        <w:t>d</w:t>
-      </w:r>
-      <w:r>
-        <w:rPr>
-          <w:rFonts w:cs="Arial" w:ascii="Arial" w:hAnsi="Arial"/>
-          <w:color w:themeColor="text1" w:val="000000"/>
-          <w:sz w:val="24"/>
-          <w:szCs w:val="24"/>
-        </w:rPr>
-        <w:t>isplay to one</w:t>
-      </w:r>
-      <w:r>
-        <w:rPr>
-          <w:rFonts w:cs="Arial" w:ascii="Arial" w:hAnsi="Arial"/>
-          <w:color w:themeColor="text1" w:val="000000"/>
-          <w:sz w:val="24"/>
-          <w:szCs w:val="24"/>
-        </w:rPr>
-        <w:t xml:space="preserve">. </w:t>
-      </w:r>
-      <w:r>
-        <w:rPr>
-          <w:rFonts w:cs="Arial" w:ascii="Arial" w:hAnsi="Arial"/>
-          <w:color w:themeColor="text1" w:val="000000"/>
-          <w:sz w:val="24"/>
-          <w:szCs w:val="24"/>
-        </w:rPr>
-        <w:t>C</w:t>
-      </w:r>
-      <w:r>
-        <w:rPr>
-          <w:rFonts w:cs="Arial" w:ascii="Arial" w:hAnsi="Arial"/>
-          <w:color w:themeColor="text1" w:val="000000"/>
-          <w:sz w:val="24"/>
-          <w:szCs w:val="24"/>
-        </w:rPr>
-        <w:t xml:space="preserve">licking the bottom of Pin 0 should display a zero on the emulator. </w:t>
-      </w:r>
-      <w:r>
-        <w:rPr>
-          <w:rFonts w:cs="Arial" w:ascii="Arial" w:hAnsi="Arial"/>
-          <w:color w:themeColor="text1" w:val="000000"/>
-          <w:sz w:val="24"/>
-          <w:szCs w:val="24"/>
-        </w:rPr>
-        <w:t>If your program is working correctly, then it is time to download it to the micro:bit. Before we download it, let’s give our program a name.  Click on the word “Untitled” in the textbook on the bottom left side of the editor.</w:t>
+        <w:t>Once you have completed assembling your blocks, click Pin 0 on the emulator. Clicking the top of Pin 0 in the emulator should change the display to one. Clicking the bottom of Pin 0 should display a zero on the emulator. If your program is working correctly, then it is time to download it to the micro:bit. Before we download it, let’s give our program a name.  Click on the word “Untitled” in the textbook on the bottom left side of the editor.</w:t>
       </w:r>
     </w:p>
     <w:p>
@@ -2059,34 +1540,7 @@
           <w:sz w:val="24"/>
           <w:szCs w:val="24"/>
         </w:rPr>
-        <w:t>Name your program “</w:t>
-      </w:r>
-      <w:r>
-        <w:rPr>
-          <w:rFonts w:cs="Arial" w:ascii="Arial" w:hAnsi="Arial"/>
-          <w:color w:themeColor="text1" w:val="000000"/>
-          <w:sz w:val="24"/>
-          <w:szCs w:val="24"/>
-        </w:rPr>
-        <w:t>P</w:t>
-      </w:r>
-      <w:r>
-        <w:rPr>
-          <w:rFonts w:cs="Arial" w:ascii="Arial" w:hAnsi="Arial"/>
-          <w:color w:themeColor="text1" w:val="000000"/>
-          <w:sz w:val="24"/>
-          <w:szCs w:val="24"/>
-        </w:rPr>
-        <w:t>ush button on breadboard</w:t>
-      </w:r>
-      <w:r>
-        <w:rPr>
-          <w:rFonts w:cs="Arial" w:ascii="Arial" w:hAnsi="Arial"/>
-          <w:color w:themeColor="text1" w:val="000000"/>
-          <w:sz w:val="24"/>
-          <w:szCs w:val="24"/>
-        </w:rPr>
-        <w:t>”. You do NOT need to click the disk icon to change the name—pressing the disk icon will save your program by downloading it to your computer.</w:t>
+        <w:t>Name your program “Push button on breadboard”. You do NOT need to click the disk icon to change the name—pressing the disk icon will save your program by downloading it to your computer.</w:t>
       </w:r>
     </w:p>
     <w:p>
@@ -2427,7 +1881,7 @@
           <w:szCs w:val="24"/>
         </w:rPr>
         <w:drawing>
-          <wp:anchor behindDoc="1" distT="0" distB="0" distL="0" distR="0" simplePos="0" locked="0" layoutInCell="1" allowOverlap="1" relativeHeight="35">
+          <wp:anchor behindDoc="1" distT="0" distB="0" distL="0" distR="0" simplePos="0" locked="0" layoutInCell="1" allowOverlap="1" relativeHeight="34">
             <wp:simplePos x="0" y="0"/>
             <wp:positionH relativeFrom="column">
               <wp:posOffset>2165350</wp:posOffset>
@@ -2803,39 +2257,7 @@
           <w:sz w:val="28"/>
           <w:szCs w:val="28"/>
         </w:rPr>
-        <w:t xml:space="preserve">You have created your </w:t>
-      </w:r>
-      <w:r>
-        <w:rPr>
-          <w:rFonts w:cs="Arial" w:ascii="Gill Sans Nova Cond XBd" w:hAnsi="Gill Sans Nova Cond XBd"/>
-          <w:sz w:val="28"/>
-          <w:szCs w:val="28"/>
-        </w:rPr>
-        <w:t xml:space="preserve">Breadboard </w:t>
-      </w:r>
-      <w:r>
-        <w:rPr>
-          <w:rFonts w:cs="Arial" w:ascii="Gill Sans Nova Cond XBd" w:hAnsi="Gill Sans Nova Cond XBd"/>
-          <w:sz w:val="28"/>
-          <w:szCs w:val="28"/>
-        </w:rPr>
-        <w:t>P</w:t>
-      </w:r>
-      <w:r>
-        <w:rPr>
-          <w:rFonts w:cs="Arial" w:ascii="Gill Sans Nova Cond XBd" w:hAnsi="Gill Sans Nova Cond XBd"/>
-          <w:sz w:val="28"/>
-          <w:szCs w:val="28"/>
-        </w:rPr>
-        <w:t>ushbutton</w:t>
-      </w:r>
-      <w:r>
-        <w:rPr>
-          <w:rFonts w:cs="Arial" w:ascii="Gill Sans Nova Cond XBd" w:hAnsi="Gill Sans Nova Cond XBd"/>
-          <w:sz w:val="28"/>
-          <w:szCs w:val="28"/>
-        </w:rPr>
-        <w:t xml:space="preserve"> program!!</w:t>
+        <w:t>You have created your Breadboard Pushbutton program!!</w:t>
       </w:r>
     </w:p>
     <w:p>
@@ -3026,31 +2448,7 @@
           <w:sz w:val="20"/>
           <w:szCs w:val="20"/>
         </w:rPr>
-        <w:t xml:space="preserve">Online </w:t>
-      </w:r>
-      <w:r>
-        <w:rPr>
-          <w:rFonts w:cs="Arial" w:ascii="Arial" w:hAnsi="Arial"/>
-          <w:sz w:val="20"/>
-          <w:szCs w:val="20"/>
-        </w:rPr>
-        <w:t>P</w:t>
-      </w:r>
-      <w:r>
-        <w:rPr>
-          <w:rFonts w:cs="Arial" w:ascii="Arial" w:hAnsi="Arial"/>
-          <w:sz w:val="20"/>
-          <w:szCs w:val="20"/>
-        </w:rPr>
-        <w:t>ushbutton</w:t>
-      </w:r>
-      <w:r>
-        <w:rPr>
-          <w:rFonts w:cs="Arial" w:ascii="Arial" w:hAnsi="Arial"/>
-          <w:sz w:val="20"/>
-          <w:szCs w:val="20"/>
-        </w:rPr>
-        <w:t xml:space="preserve"> tutorial:  </w:t>
+        <w:t xml:space="preserve">Online Pushbutton tutorial:  </w:t>
       </w:r>
       <w:r>
         <w:rPr>
@@ -3131,7 +2529,7 @@
       <mc:AlternateContent>
         <mc:Choice Requires="wps">
           <w:drawing>
-            <wp:anchor behindDoc="1" distT="6985" distB="6350" distL="6350" distR="6985" simplePos="0" locked="0" layoutInCell="0" allowOverlap="1" relativeHeight="16" wp14:anchorId="727FC752">
+            <wp:anchor behindDoc="1" distT="6985" distB="6350" distL="6350" distR="6985" simplePos="0" locked="0" layoutInCell="0" allowOverlap="1" relativeHeight="15" wp14:anchorId="727FC752">
               <wp:simplePos x="0" y="0"/>
               <wp:positionH relativeFrom="margin">
                 <wp:align>center</wp:align>
@@ -3193,7 +2591,7 @@
       <mc:AlternateContent>
         <mc:Choice Requires="wps">
           <w:drawing>
-            <wp:anchor behindDoc="1" distT="15240" distB="15240" distL="15875" distR="14605" simplePos="0" locked="0" layoutInCell="0" allowOverlap="1" relativeHeight="30" wp14:anchorId="7D4F9E7B">
+            <wp:anchor behindDoc="1" distT="15240" distB="15240" distL="15875" distR="14605" simplePos="0" locked="0" layoutInCell="0" allowOverlap="1" relativeHeight="29" wp14:anchorId="7D4F9E7B">
               <wp:simplePos x="0" y="0"/>
               <wp:positionH relativeFrom="margin">
                 <wp:align>center</wp:align>
@@ -3248,7 +2646,7 @@
                           <w:sdtContent>
                             <w:p>
                               <w:pPr>
-                                <w:pStyle w:val="FrameContents"/>
+                                <w:pStyle w:val="FrameContentsuser"/>
                                 <w:jc w:val="center"/>
                                 <w:rPr>
                                   <w:color w:val="000000"/>
@@ -3339,7 +2737,7 @@
                     <w:sdtContent>
                       <w:p>
                         <w:pPr>
-                          <w:pStyle w:val="FrameContents"/>
+                          <w:pStyle w:val="FrameContentsuser"/>
                           <w:jc w:val="center"/>
                           <w:rPr>
                             <w:color w:val="000000"/>
@@ -3402,7 +2800,7 @@
       <mc:AlternateContent>
         <mc:Choice Requires="wps">
           <w:drawing>
-            <wp:anchor behindDoc="1" distT="6985" distB="6350" distL="6350" distR="6985" simplePos="0" locked="0" layoutInCell="0" allowOverlap="1" relativeHeight="16" wp14:anchorId="727FC752">
+            <wp:anchor behindDoc="1" distT="6985" distB="6350" distL="6350" distR="6985" simplePos="0" locked="0" layoutInCell="0" allowOverlap="1" relativeHeight="15" wp14:anchorId="727FC752">
               <wp:simplePos x="0" y="0"/>
               <wp:positionH relativeFrom="margin">
                 <wp:align>center</wp:align>
@@ -3460,7 +2858,7 @@
       <mc:AlternateContent>
         <mc:Choice Requires="wps">
           <w:drawing>
-            <wp:anchor behindDoc="1" distT="15240" distB="15240" distL="15875" distR="14605" simplePos="0" locked="0" layoutInCell="0" allowOverlap="1" relativeHeight="30" wp14:anchorId="7D4F9E7B">
+            <wp:anchor behindDoc="1" distT="15240" distB="15240" distL="15875" distR="14605" simplePos="0" locked="0" layoutInCell="0" allowOverlap="1" relativeHeight="29" wp14:anchorId="7D4F9E7B">
               <wp:simplePos x="0" y="0"/>
               <wp:positionH relativeFrom="margin">
                 <wp:align>center</wp:align>
@@ -3515,7 +2913,7 @@
                           <w:sdtContent>
                             <w:p>
                               <w:pPr>
-                                <w:pStyle w:val="FrameContents"/>
+                                <w:pStyle w:val="FrameContentsuser"/>
                                 <w:jc w:val="center"/>
                                 <w:rPr>
                                   <w:color w:val="000000"/>
@@ -3586,7 +2984,7 @@
                     <w:sdtContent>
                       <w:p>
                         <w:pPr>
-                          <w:pStyle w:val="FrameContents"/>
+                          <w:pStyle w:val="FrameContentsuser"/>
                           <w:jc w:val="center"/>
                           <w:rPr>
                             <w:color w:val="000000"/>
@@ -4228,15 +3626,15 @@
       <w:lang w:val="en-US"/>
     </w:rPr>
   </w:style>
-  <w:style w:type="paragraph" w:styleId="FrameContents">
-    <w:name w:val="Frame Contents"/>
+  <w:style w:type="paragraph" w:styleId="FrameContentsuser">
+    <w:name w:val="Frame Contents (user)"/>
     <w:basedOn w:val="Normal"/>
     <w:qFormat/>
     <w:pPr/>
     <w:rPr/>
   </w:style>
-  <w:style w:type="paragraph" w:styleId="FrameContentsuser">
-    <w:name w:val="Frame Contents (user)"/>
+  <w:style w:type="paragraph" w:styleId="FrameContents">
+    <w:name w:val="Frame Contents"/>
     <w:basedOn w:val="Normal"/>
     <w:qFormat/>
     <w:pPr/>

</xml_diff>